<commit_message>
KAXITI ishchi o'quv dasturi added
</commit_message>
<xml_diff>
--- a/2-kaf. Ishchi, na'munaviy dasturlar va adabiyotlar (27.06.2026)/1. Milliy/2. SIT/SIT na'munaviy dastur.docx
+++ b/2-kaf. Ishchi, na'munaviy dasturlar va adabiyotlar (27.06.2026)/1. Milliy/2. SIT/SIT na'munaviy dastur.docx
@@ -5,6 +5,9 @@
     <w:p>
       <w:pPr>
         <w:pStyle w:val="3"/>
+        <w:keepNext w:val="0"/>
+        <w:keepLines w:val="0"/>
+        <w:widowControl w:val="0"/>
         <w:spacing w:before="120" w:after="120" w:line="240" w:lineRule="auto"/>
         <w:jc w:val="center"/>
         <w:rPr>
@@ -85,6 +88,7 @@
     <w:p>
       <w:pPr>
         <w:pStyle w:val="a9"/>
+        <w:widowControl w:val="0"/>
         <w:spacing w:before="120" w:beforeAutospacing="0" w:after="120" w:afterAutospacing="0"/>
         <w:jc w:val="center"/>
         <w:rPr>
@@ -287,6 +291,7 @@
     <w:p>
       <w:pPr>
         <w:pStyle w:val="a9"/>
+        <w:widowControl w:val="0"/>
         <w:spacing w:before="0" w:beforeAutospacing="0" w:after="0" w:afterAutospacing="0"/>
         <w:ind w:firstLine="709"/>
         <w:jc w:val="both"/>
@@ -1259,6 +1264,7 @@
     <w:p>
       <w:pPr>
         <w:pStyle w:val="a9"/>
+        <w:widowControl w:val="0"/>
         <w:spacing w:before="0" w:beforeAutospacing="0" w:after="0" w:afterAutospacing="0"/>
         <w:ind w:firstLine="709"/>
         <w:jc w:val="both"/>
@@ -2599,6 +2605,7 @@
     <w:p>
       <w:pPr>
         <w:pStyle w:val="a9"/>
+        <w:widowControl w:val="0"/>
         <w:spacing w:before="120" w:beforeAutospacing="0" w:after="120" w:afterAutospacing="0"/>
         <w:jc w:val="center"/>
         <w:rPr>
@@ -2712,6 +2719,7 @@
     </w:p>
     <w:p>
       <w:pPr>
+        <w:widowControl w:val="0"/>
         <w:tabs>
           <w:tab w:val="left" w:pos="142"/>
         </w:tabs>
@@ -2745,6 +2753,7 @@
     </w:p>
     <w:p>
       <w:pPr>
+        <w:widowControl w:val="0"/>
         <w:tabs>
           <w:tab w:val="left" w:pos="142"/>
         </w:tabs>
@@ -2770,6 +2779,7 @@
     </w:p>
     <w:p>
       <w:pPr>
+        <w:widowControl w:val="0"/>
         <w:tabs>
           <w:tab w:val="left" w:pos="142"/>
         </w:tabs>
@@ -2793,6 +2803,7 @@
     </w:p>
     <w:p>
       <w:pPr>
+        <w:widowControl w:val="0"/>
         <w:tabs>
           <w:tab w:val="left" w:pos="142"/>
         </w:tabs>
@@ -2816,6 +2827,7 @@
     </w:p>
     <w:p>
       <w:pPr>
+        <w:widowControl w:val="0"/>
         <w:tabs>
           <w:tab w:val="left" w:pos="142"/>
         </w:tabs>
@@ -2839,6 +2851,7 @@
     </w:p>
     <w:p>
       <w:pPr>
+        <w:widowControl w:val="0"/>
         <w:tabs>
           <w:tab w:val="left" w:pos="142"/>
         </w:tabs>
@@ -2862,6 +2875,7 @@
     </w:p>
     <w:p>
       <w:pPr>
+        <w:widowControl w:val="0"/>
         <w:tabs>
           <w:tab w:val="left" w:pos="142"/>
         </w:tabs>
@@ -2886,6 +2900,7 @@
     <w:p>
       <w:pPr>
         <w:pStyle w:val="a9"/>
+        <w:widowControl w:val="0"/>
         <w:spacing w:before="120" w:beforeAutospacing="0" w:after="120" w:afterAutospacing="0"/>
         <w:jc w:val="center"/>
         <w:rPr>
@@ -2968,6 +2983,7 @@
     <w:p>
       <w:pPr>
         <w:pStyle w:val="a9"/>
+        <w:widowControl w:val="0"/>
         <w:spacing w:before="0" w:beforeAutospacing="0" w:after="0" w:afterAutospacing="0"/>
         <w:ind w:firstLine="709"/>
         <w:jc w:val="both"/>
@@ -7273,6 +7289,7 @@
     <w:p>
       <w:pPr>
         <w:pStyle w:val="a9"/>
+        <w:widowControl w:val="0"/>
         <w:spacing w:before="0" w:beforeAutospacing="0" w:after="0" w:afterAutospacing="0"/>
         <w:ind w:firstLine="709"/>
         <w:jc w:val="both"/>
@@ -12066,6 +12083,7 @@
     <w:p>
       <w:pPr>
         <w:pStyle w:val="a9"/>
+        <w:widowControl w:val="0"/>
         <w:spacing w:before="0" w:beforeAutospacing="0" w:after="0" w:afterAutospacing="0"/>
         <w:ind w:firstLine="709"/>
         <w:jc w:val="both"/>
@@ -15186,6 +15204,7 @@
     <w:p>
       <w:pPr>
         <w:pStyle w:val="a9"/>
+        <w:widowControl w:val="0"/>
         <w:spacing w:before="0" w:beforeAutospacing="0" w:after="0" w:afterAutospacing="0"/>
         <w:ind w:firstLine="709"/>
         <w:jc w:val="both"/>
@@ -17854,6 +17873,7 @@
     <w:p>
       <w:pPr>
         <w:pStyle w:val="a9"/>
+        <w:widowControl w:val="0"/>
         <w:spacing w:before="0" w:beforeAutospacing="0" w:after="0" w:afterAutospacing="0"/>
         <w:ind w:firstLine="709"/>
         <w:jc w:val="both"/>
@@ -20314,6 +20334,7 @@
     <w:p>
       <w:pPr>
         <w:pStyle w:val="a9"/>
+        <w:widowControl w:val="0"/>
         <w:spacing w:before="0" w:beforeAutospacing="0" w:after="0" w:afterAutospacing="0" w:line="252" w:lineRule="auto"/>
         <w:ind w:firstLine="709"/>
         <w:jc w:val="both"/>
@@ -23963,6 +23984,7 @@
     <w:p>
       <w:pPr>
         <w:pStyle w:val="a9"/>
+        <w:widowControl w:val="0"/>
         <w:spacing w:before="120" w:beforeAutospacing="0" w:after="120" w:afterAutospacing="0" w:line="252" w:lineRule="auto"/>
         <w:jc w:val="center"/>
         <w:rPr>
@@ -24105,6 +24127,7 @@
     <w:p>
       <w:pPr>
         <w:pStyle w:val="a9"/>
+        <w:widowControl w:val="0"/>
         <w:spacing w:before="0" w:beforeAutospacing="0" w:after="0" w:afterAutospacing="0" w:line="252" w:lineRule="auto"/>
         <w:ind w:firstLine="709"/>
         <w:jc w:val="both"/>
@@ -25212,6 +25235,7 @@
     <w:p>
       <w:pPr>
         <w:pStyle w:val="a9"/>
+        <w:widowControl w:val="0"/>
         <w:spacing w:before="0" w:beforeAutospacing="0" w:after="0" w:afterAutospacing="0" w:line="252" w:lineRule="auto"/>
         <w:ind w:firstLine="709"/>
         <w:jc w:val="both"/>
@@ -26232,6 +26256,7 @@
     <w:p>
       <w:pPr>
         <w:pStyle w:val="a9"/>
+        <w:widowControl w:val="0"/>
         <w:spacing w:before="0" w:beforeAutospacing="0" w:after="0" w:afterAutospacing="0" w:line="252" w:lineRule="auto"/>
         <w:ind w:firstLine="709"/>
         <w:jc w:val="both"/>
@@ -27732,6 +27757,7 @@
     <w:p>
       <w:pPr>
         <w:pStyle w:val="a9"/>
+        <w:widowControl w:val="0"/>
         <w:spacing w:before="0" w:beforeAutospacing="0" w:after="0" w:afterAutospacing="0" w:line="252" w:lineRule="auto"/>
         <w:ind w:firstLine="709"/>
         <w:jc w:val="both"/>
@@ -28512,6 +28538,7 @@
     <w:p>
       <w:pPr>
         <w:pStyle w:val="a9"/>
+        <w:widowControl w:val="0"/>
         <w:spacing w:before="0" w:beforeAutospacing="0" w:after="0" w:afterAutospacing="0" w:line="252" w:lineRule="auto"/>
         <w:ind w:firstLine="709"/>
         <w:jc w:val="both"/>
@@ -28528,159 +28555,159 @@
           <w:sz w:val="26"/>
           <w:szCs w:val="26"/>
         </w:rPr>
+        <w:t>“</w:t>
+      </w:r>
+      <w:proofErr w:type="spellStart"/>
+      <w:r>
+        <w:rPr>
+          <w:sz w:val="26"/>
+          <w:szCs w:val="26"/>
+        </w:rPr>
+        <w:t>Sun’iy</w:t>
+      </w:r>
+      <w:proofErr w:type="spellEnd"/>
+      <w:r>
+        <w:rPr>
+          <w:sz w:val="26"/>
+          <w:szCs w:val="26"/>
+        </w:rPr>
+        <w:t xml:space="preserve"> </w:t>
+      </w:r>
+      <w:proofErr w:type="spellStart"/>
+      <w:r>
+        <w:rPr>
+          <w:sz w:val="26"/>
+          <w:szCs w:val="26"/>
+        </w:rPr>
+        <w:t>intellekt</w:t>
+      </w:r>
+      <w:proofErr w:type="spellEnd"/>
+      <w:r>
+        <w:rPr>
+          <w:sz w:val="26"/>
+          <w:szCs w:val="26"/>
+        </w:rPr>
+        <w:t xml:space="preserve"> </w:t>
+      </w:r>
+      <w:proofErr w:type="spellStart"/>
+      <w:r>
+        <w:rPr>
+          <w:sz w:val="26"/>
+          <w:szCs w:val="26"/>
+        </w:rPr>
+        <w:t>texnologiyalari</w:t>
+      </w:r>
+      <w:proofErr w:type="spellEnd"/>
+      <w:r>
+        <w:rPr>
+          <w:sz w:val="26"/>
+          <w:szCs w:val="26"/>
+        </w:rPr>
+        <w:t xml:space="preserve">” </w:t>
+      </w:r>
+      <w:proofErr w:type="spellStart"/>
+      <w:r>
+        <w:rPr>
+          <w:sz w:val="26"/>
+          <w:szCs w:val="26"/>
+        </w:rPr>
+        <w:t>fanini</w:t>
+      </w:r>
+      <w:proofErr w:type="spellEnd"/>
+      <w:r>
+        <w:rPr>
+          <w:sz w:val="26"/>
+          <w:szCs w:val="26"/>
+        </w:rPr>
+        <w:t xml:space="preserve"> </w:t>
+      </w:r>
+      <w:proofErr w:type="spellStart"/>
+      <w:r>
+        <w:rPr>
+          <w:sz w:val="26"/>
+          <w:szCs w:val="26"/>
+        </w:rPr>
+        <w:t>oʻqitish</w:t>
+      </w:r>
+      <w:proofErr w:type="spellEnd"/>
+      <w:r>
+        <w:rPr>
+          <w:sz w:val="26"/>
+          <w:szCs w:val="26"/>
+        </w:rPr>
+        <w:t xml:space="preserve"> </w:t>
+      </w:r>
+      <w:proofErr w:type="spellStart"/>
+      <w:r>
+        <w:rPr>
+          <w:sz w:val="26"/>
+          <w:szCs w:val="26"/>
+        </w:rPr>
+        <w:t>davomida</w:t>
+      </w:r>
+      <w:proofErr w:type="spellEnd"/>
+      <w:r>
+        <w:rPr>
+          <w:sz w:val="26"/>
+          <w:szCs w:val="26"/>
+        </w:rPr>
+        <w:t xml:space="preserve"> </w:t>
+      </w:r>
+      <w:proofErr w:type="spellStart"/>
+      <w:r>
+        <w:rPr>
+          <w:sz w:val="26"/>
+          <w:szCs w:val="26"/>
+        </w:rPr>
+        <w:t>kursantlarni</w:t>
+      </w:r>
+      <w:proofErr w:type="spellEnd"/>
+      <w:r>
+        <w:rPr>
+          <w:sz w:val="26"/>
+          <w:szCs w:val="26"/>
+        </w:rPr>
+        <w:t xml:space="preserve"> </w:t>
+      </w:r>
+      <w:proofErr w:type="spellStart"/>
+      <w:r>
+        <w:rPr>
+          <w:sz w:val="26"/>
+          <w:szCs w:val="26"/>
+        </w:rPr>
+        <w:t>mustaqil</w:t>
+      </w:r>
+      <w:proofErr w:type="spellEnd"/>
+      <w:r>
+        <w:rPr>
+          <w:sz w:val="26"/>
+          <w:szCs w:val="26"/>
+        </w:rPr>
+        <w:t xml:space="preserve"> </w:t>
+      </w:r>
+      <w:proofErr w:type="spellStart"/>
+      <w:r>
+        <w:rPr>
+          <w:sz w:val="26"/>
+          <w:szCs w:val="26"/>
+        </w:rPr>
+        <w:t>va</w:t>
+      </w:r>
+      <w:proofErr w:type="spellEnd"/>
+      <w:r>
+        <w:rPr>
+          <w:sz w:val="26"/>
+          <w:szCs w:val="26"/>
+        </w:rPr>
+        <w:t xml:space="preserve"> </w:t>
+      </w:r>
+      <w:proofErr w:type="spellStart"/>
+      <w:r>
+        <w:rPr>
+          <w:sz w:val="26"/>
+          <w:szCs w:val="26"/>
+        </w:rPr>
         <w:lastRenderedPageBreak/>
-        <w:t>“</w:t>
-      </w:r>
-      <w:proofErr w:type="spellStart"/>
-      <w:r>
-        <w:rPr>
-          <w:sz w:val="26"/>
-          <w:szCs w:val="26"/>
-        </w:rPr>
-        <w:t>Sun’iy</w:t>
-      </w:r>
-      <w:proofErr w:type="spellEnd"/>
-      <w:r>
-        <w:rPr>
-          <w:sz w:val="26"/>
-          <w:szCs w:val="26"/>
-        </w:rPr>
-        <w:t xml:space="preserve"> </w:t>
-      </w:r>
-      <w:proofErr w:type="spellStart"/>
-      <w:r>
-        <w:rPr>
-          <w:sz w:val="26"/>
-          <w:szCs w:val="26"/>
-        </w:rPr>
-        <w:t>intellekt</w:t>
-      </w:r>
-      <w:proofErr w:type="spellEnd"/>
-      <w:r>
-        <w:rPr>
-          <w:sz w:val="26"/>
-          <w:szCs w:val="26"/>
-        </w:rPr>
-        <w:t xml:space="preserve"> </w:t>
-      </w:r>
-      <w:proofErr w:type="spellStart"/>
-      <w:r>
-        <w:rPr>
-          <w:sz w:val="26"/>
-          <w:szCs w:val="26"/>
-        </w:rPr>
-        <w:t>texnologiyalari</w:t>
-      </w:r>
-      <w:proofErr w:type="spellEnd"/>
-      <w:r>
-        <w:rPr>
-          <w:sz w:val="26"/>
-          <w:szCs w:val="26"/>
-        </w:rPr>
-        <w:t xml:space="preserve">” </w:t>
-      </w:r>
-      <w:proofErr w:type="spellStart"/>
-      <w:r>
-        <w:rPr>
-          <w:sz w:val="26"/>
-          <w:szCs w:val="26"/>
-        </w:rPr>
-        <w:t>fanini</w:t>
-      </w:r>
-      <w:proofErr w:type="spellEnd"/>
-      <w:r>
-        <w:rPr>
-          <w:sz w:val="26"/>
-          <w:szCs w:val="26"/>
-        </w:rPr>
-        <w:t xml:space="preserve"> </w:t>
-      </w:r>
-      <w:proofErr w:type="spellStart"/>
-      <w:r>
-        <w:rPr>
-          <w:sz w:val="26"/>
-          <w:szCs w:val="26"/>
-        </w:rPr>
-        <w:t>oʻqitish</w:t>
-      </w:r>
-      <w:proofErr w:type="spellEnd"/>
-      <w:r>
-        <w:rPr>
-          <w:sz w:val="26"/>
-          <w:szCs w:val="26"/>
-        </w:rPr>
-        <w:t xml:space="preserve"> </w:t>
-      </w:r>
-      <w:proofErr w:type="spellStart"/>
-      <w:r>
-        <w:rPr>
-          <w:sz w:val="26"/>
-          <w:szCs w:val="26"/>
-        </w:rPr>
-        <w:t>davomida</w:t>
-      </w:r>
-      <w:proofErr w:type="spellEnd"/>
-      <w:r>
-        <w:rPr>
-          <w:sz w:val="26"/>
-          <w:szCs w:val="26"/>
-        </w:rPr>
-        <w:t xml:space="preserve"> </w:t>
-      </w:r>
-      <w:proofErr w:type="spellStart"/>
-      <w:r>
-        <w:rPr>
-          <w:sz w:val="26"/>
-          <w:szCs w:val="26"/>
-        </w:rPr>
-        <w:t>kursantlarni</w:t>
-      </w:r>
-      <w:proofErr w:type="spellEnd"/>
-      <w:r>
-        <w:rPr>
-          <w:sz w:val="26"/>
-          <w:szCs w:val="26"/>
-        </w:rPr>
-        <w:t xml:space="preserve"> </w:t>
-      </w:r>
-      <w:proofErr w:type="spellStart"/>
-      <w:r>
-        <w:rPr>
-          <w:sz w:val="26"/>
-          <w:szCs w:val="26"/>
-        </w:rPr>
-        <w:t>mustaqil</w:t>
-      </w:r>
-      <w:proofErr w:type="spellEnd"/>
-      <w:r>
-        <w:rPr>
-          <w:sz w:val="26"/>
-          <w:szCs w:val="26"/>
-        </w:rPr>
-        <w:t xml:space="preserve"> </w:t>
-      </w:r>
-      <w:proofErr w:type="spellStart"/>
-      <w:r>
-        <w:rPr>
-          <w:sz w:val="26"/>
-          <w:szCs w:val="26"/>
-        </w:rPr>
-        <w:t>va</w:t>
-      </w:r>
-      <w:proofErr w:type="spellEnd"/>
-      <w:r>
-        <w:rPr>
-          <w:sz w:val="26"/>
-          <w:szCs w:val="26"/>
-        </w:rPr>
-        <w:t xml:space="preserve"> </w:t>
-      </w:r>
-      <w:proofErr w:type="spellStart"/>
-      <w:r>
-        <w:rPr>
-          <w:sz w:val="26"/>
-          <w:szCs w:val="26"/>
-        </w:rPr>
         <w:t>erkin</w:t>
       </w:r>
       <w:proofErr w:type="spellEnd"/>
@@ -29606,7 +29633,8 @@
     </w:p>
     <w:p>
       <w:pPr>
-        <w:spacing w:after="0" w:line="240" w:lineRule="auto"/>
+        <w:widowControl w:val="0"/>
+        <w:spacing w:before="120" w:after="120" w:line="240" w:lineRule="auto"/>
         <w:ind w:firstLine="709"/>
         <w:jc w:val="center"/>
         <w:rPr>
@@ -29625,11 +29653,12 @@
           <w:szCs w:val="26"/>
           <w:lang w:val="uz-Cyrl-UZ"/>
         </w:rPr>
-        <w:t>5. Mustaqil ta’lim va mustaqil ishlar.</w:t>
+        <w:t>5. Mustaqil ta’lim va mustaqil ishlar</w:t>
       </w:r>
     </w:p>
     <w:p>
       <w:pPr>
+        <w:widowControl w:val="0"/>
         <w:spacing w:after="0" w:line="240" w:lineRule="auto"/>
         <w:ind w:firstLine="709"/>
         <w:rPr>
@@ -29663,6 +29692,7 @@
           </w:tcPr>
           <w:p>
             <w:pPr>
+              <w:widowControl w:val="0"/>
               <w:spacing w:after="0" w:line="240" w:lineRule="auto"/>
               <w:jc w:val="center"/>
               <w:rPr>
@@ -29694,6 +29724,7 @@
           </w:tcPr>
           <w:p>
             <w:pPr>
+              <w:widowControl w:val="0"/>
               <w:spacing w:after="0" w:line="240" w:lineRule="auto"/>
               <w:jc w:val="center"/>
               <w:rPr>
@@ -29771,6 +29802,7 @@
           </w:tcPr>
           <w:p>
             <w:pPr>
+              <w:widowControl w:val="0"/>
               <w:spacing w:after="0" w:line="240" w:lineRule="auto"/>
               <w:jc w:val="center"/>
               <w:rPr>
@@ -29850,6 +29882,7 @@
           </w:tcPr>
           <w:p>
             <w:pPr>
+              <w:widowControl w:val="0"/>
               <w:spacing w:after="0" w:line="240" w:lineRule="auto"/>
               <w:jc w:val="center"/>
               <w:rPr>
@@ -29878,6 +29911,7 @@
           </w:tcPr>
           <w:p>
             <w:pPr>
+              <w:widowControl w:val="0"/>
               <w:spacing w:after="0" w:line="240" w:lineRule="auto"/>
               <w:jc w:val="both"/>
               <w:rPr>
@@ -30391,6 +30425,7 @@
           </w:tcPr>
           <w:p>
             <w:pPr>
+              <w:widowControl w:val="0"/>
               <w:spacing w:after="0" w:line="240" w:lineRule="auto"/>
               <w:jc w:val="center"/>
               <w:rPr>
@@ -30421,6 +30456,7 @@
           </w:tcPr>
           <w:p>
             <w:pPr>
+              <w:widowControl w:val="0"/>
               <w:spacing w:after="0" w:line="240" w:lineRule="auto"/>
               <w:jc w:val="center"/>
               <w:rPr>
@@ -30449,6 +30485,7 @@
           </w:tcPr>
           <w:p>
             <w:pPr>
+              <w:widowControl w:val="0"/>
               <w:spacing w:after="0" w:line="240" w:lineRule="auto"/>
               <w:jc w:val="both"/>
               <w:rPr>
@@ -30964,6 +31001,7 @@
           </w:tcPr>
           <w:p>
             <w:pPr>
+              <w:widowControl w:val="0"/>
               <w:spacing w:after="0" w:line="240" w:lineRule="auto"/>
               <w:jc w:val="center"/>
               <w:rPr>
@@ -30993,6 +31031,7 @@
           </w:tcPr>
           <w:p>
             <w:pPr>
+              <w:widowControl w:val="0"/>
               <w:spacing w:after="0" w:line="240" w:lineRule="auto"/>
               <w:jc w:val="center"/>
               <w:rPr>
@@ -31021,6 +31060,7 @@
           </w:tcPr>
           <w:p>
             <w:pPr>
+              <w:widowControl w:val="0"/>
               <w:spacing w:after="0" w:line="240" w:lineRule="auto"/>
               <w:jc w:val="both"/>
               <w:rPr>
@@ -31492,6 +31532,7 @@
           </w:tcPr>
           <w:p>
             <w:pPr>
+              <w:widowControl w:val="0"/>
               <w:spacing w:after="0" w:line="240" w:lineRule="auto"/>
               <w:jc w:val="center"/>
               <w:rPr>
@@ -31522,6 +31563,7 @@
           </w:tcPr>
           <w:p>
             <w:pPr>
+              <w:widowControl w:val="0"/>
               <w:spacing w:after="0" w:line="240" w:lineRule="auto"/>
               <w:jc w:val="center"/>
               <w:rPr>
@@ -31550,6 +31592,7 @@
           </w:tcPr>
           <w:p>
             <w:pPr>
+              <w:widowControl w:val="0"/>
               <w:spacing w:after="0" w:line="240" w:lineRule="auto"/>
               <w:jc w:val="both"/>
               <w:rPr>
@@ -32087,6 +32130,7 @@
           </w:tcPr>
           <w:p>
             <w:pPr>
+              <w:widowControl w:val="0"/>
               <w:spacing w:after="0" w:line="240" w:lineRule="auto"/>
               <w:jc w:val="center"/>
               <w:rPr>
@@ -32117,6 +32161,7 @@
           </w:tcPr>
           <w:p>
             <w:pPr>
+              <w:widowControl w:val="0"/>
               <w:spacing w:after="0" w:line="240" w:lineRule="auto"/>
               <w:jc w:val="center"/>
               <w:rPr>
@@ -32144,6 +32189,7 @@
           </w:tcPr>
           <w:p>
             <w:pPr>
+              <w:widowControl w:val="0"/>
               <w:spacing w:after="0" w:line="240" w:lineRule="auto"/>
               <w:jc w:val="both"/>
               <w:rPr>
@@ -32703,6 +32749,7 @@
           </w:tcPr>
           <w:p>
             <w:pPr>
+              <w:widowControl w:val="0"/>
               <w:spacing w:after="0" w:line="240" w:lineRule="auto"/>
               <w:jc w:val="center"/>
               <w:rPr>
@@ -32732,6 +32779,7 @@
           </w:tcPr>
           <w:p>
             <w:pPr>
+              <w:widowControl w:val="0"/>
               <w:spacing w:after="0" w:line="240" w:lineRule="auto"/>
               <w:jc w:val="center"/>
               <w:rPr>
@@ -32759,6 +32807,7 @@
           </w:tcPr>
           <w:p>
             <w:pPr>
+              <w:widowControl w:val="0"/>
               <w:spacing w:after="0" w:line="240" w:lineRule="auto"/>
               <w:jc w:val="both"/>
               <w:rPr>
@@ -33262,6 +33311,7 @@
           </w:tcPr>
           <w:p>
             <w:pPr>
+              <w:widowControl w:val="0"/>
               <w:spacing w:after="0" w:line="240" w:lineRule="auto"/>
               <w:jc w:val="center"/>
               <w:rPr>
@@ -33290,6 +33340,7 @@
           </w:tcPr>
           <w:p>
             <w:pPr>
+              <w:widowControl w:val="0"/>
               <w:spacing w:after="0" w:line="240" w:lineRule="auto"/>
               <w:jc w:val="center"/>
               <w:rPr>
@@ -33317,6 +33368,7 @@
           </w:tcPr>
           <w:p>
             <w:pPr>
+              <w:widowControl w:val="0"/>
               <w:spacing w:after="0" w:line="240" w:lineRule="auto"/>
               <w:jc w:val="both"/>
               <w:rPr>
@@ -33776,6 +33828,7 @@
           </w:tcPr>
           <w:p>
             <w:pPr>
+              <w:widowControl w:val="0"/>
               <w:spacing w:after="0" w:line="240" w:lineRule="auto"/>
               <w:jc w:val="center"/>
               <w:rPr>
@@ -33804,6 +33857,7 @@
           </w:tcPr>
           <w:p>
             <w:pPr>
+              <w:widowControl w:val="0"/>
               <w:spacing w:after="0" w:line="240" w:lineRule="auto"/>
               <w:jc w:val="center"/>
               <w:rPr>
@@ -33831,6 +33885,7 @@
           </w:tcPr>
           <w:p>
             <w:pPr>
+              <w:widowControl w:val="0"/>
               <w:spacing w:after="0" w:line="240" w:lineRule="auto"/>
               <w:jc w:val="both"/>
               <w:rPr>
@@ -34334,6 +34389,7 @@
           </w:tcPr>
           <w:p>
             <w:pPr>
+              <w:widowControl w:val="0"/>
               <w:spacing w:after="0" w:line="240" w:lineRule="auto"/>
               <w:jc w:val="center"/>
               <w:rPr>
@@ -34363,6 +34419,7 @@
           </w:tcPr>
           <w:p>
             <w:pPr>
+              <w:widowControl w:val="0"/>
               <w:spacing w:after="0" w:line="240" w:lineRule="auto"/>
               <w:jc w:val="center"/>
               <w:rPr>
@@ -34390,6 +34447,7 @@
           </w:tcPr>
           <w:p>
             <w:pPr>
+              <w:widowControl w:val="0"/>
               <w:spacing w:after="0" w:line="240" w:lineRule="auto"/>
               <w:jc w:val="both"/>
               <w:rPr>
@@ -34860,6 +34918,7 @@
           </w:tcPr>
           <w:p>
             <w:pPr>
+              <w:widowControl w:val="0"/>
               <w:spacing w:after="0" w:line="240" w:lineRule="auto"/>
               <w:jc w:val="center"/>
               <w:rPr>
@@ -34890,6 +34949,7 @@
           </w:tcPr>
           <w:p>
             <w:pPr>
+              <w:widowControl w:val="0"/>
               <w:spacing w:after="0" w:line="240" w:lineRule="auto"/>
               <w:jc w:val="center"/>
               <w:rPr>
@@ -34917,6 +34977,7 @@
           </w:tcPr>
           <w:p>
             <w:pPr>
+              <w:widowControl w:val="0"/>
               <w:spacing w:after="0" w:line="240" w:lineRule="auto"/>
               <w:jc w:val="both"/>
               <w:rPr>
@@ -35079,8 +35140,141 @@
                 <w:bdr w:val="none" w:sz="0" w:space="0" w:color="auto" w:frame="1"/>
                 <w:lang w:val="en-US"/>
               </w:rPr>
-              <w:t xml:space="preserve"> NER (Named Entity </w:t>
-            </w:r>
+              <w:t xml:space="preserve"> NER (Named Entity Recognition) </w:t>
+            </w:r>
+            <w:proofErr w:type="spellStart"/>
+            <w:r>
+              <w:rPr>
+                <w:color w:val="1F1F1F"/>
+                <w:sz w:val="24"/>
+                <w:szCs w:val="24"/>
+                <w:bdr w:val="none" w:sz="0" w:space="0" w:color="auto" w:frame="1"/>
+                <w:lang w:val="en-US"/>
+              </w:rPr>
+              <w:t>vazifalarini</w:t>
+            </w:r>
+            <w:proofErr w:type="spellEnd"/>
+            <w:r>
+              <w:rPr>
+                <w:color w:val="1F1F1F"/>
+                <w:sz w:val="24"/>
+                <w:szCs w:val="24"/>
+                <w:bdr w:val="none" w:sz="0" w:space="0" w:color="auto" w:frame="1"/>
+                <w:lang w:val="en-US"/>
+              </w:rPr>
+              <w:t xml:space="preserve"> </w:t>
+            </w:r>
+            <w:proofErr w:type="spellStart"/>
+            <w:r>
+              <w:rPr>
+                <w:color w:val="1F1F1F"/>
+                <w:sz w:val="24"/>
+                <w:szCs w:val="24"/>
+                <w:bdr w:val="none" w:sz="0" w:space="0" w:color="auto" w:frame="1"/>
+                <w:lang w:val="en-US"/>
+              </w:rPr>
+              <w:t>bajarish</w:t>
+            </w:r>
+            <w:proofErr w:type="spellEnd"/>
+            <w:r>
+              <w:rPr>
+                <w:color w:val="1F1F1F"/>
+                <w:sz w:val="24"/>
+                <w:szCs w:val="24"/>
+                <w:bdr w:val="none" w:sz="0" w:space="0" w:color="auto" w:frame="1"/>
+                <w:lang w:val="en-US"/>
+              </w:rPr>
+              <w:t xml:space="preserve"> (</w:t>
+            </w:r>
+            <w:proofErr w:type="spellStart"/>
+            <w:r>
+              <w:rPr>
+                <w:color w:val="1F1F1F"/>
+                <w:sz w:val="24"/>
+                <w:szCs w:val="24"/>
+                <w:bdr w:val="none" w:sz="0" w:space="0" w:color="auto" w:frame="1"/>
+                <w:lang w:val="en-US"/>
+              </w:rPr>
+              <w:t>Natijani</w:t>
+            </w:r>
+            <w:proofErr w:type="spellEnd"/>
+            <w:r>
+              <w:rPr>
+                <w:color w:val="1F1F1F"/>
+                <w:sz w:val="24"/>
+                <w:szCs w:val="24"/>
+                <w:bdr w:val="none" w:sz="0" w:space="0" w:color="auto" w:frame="1"/>
+                <w:lang w:val="en-US"/>
+              </w:rPr>
+              <w:t xml:space="preserve"> </w:t>
+            </w:r>
+            <w:proofErr w:type="spellStart"/>
+            <w:r>
+              <w:rPr>
+                <w:color w:val="1F1F1F"/>
+                <w:sz w:val="24"/>
+                <w:szCs w:val="24"/>
+                <w:bdr w:val="none" w:sz="0" w:space="0" w:color="auto" w:frame="1"/>
+                <w:lang w:val="en-US"/>
+              </w:rPr>
+              <w:t>Prt.Scrn</w:t>
+            </w:r>
+            <w:proofErr w:type="spellEnd"/>
+            <w:r>
+              <w:rPr>
+                <w:color w:val="1F1F1F"/>
+                <w:sz w:val="24"/>
+                <w:szCs w:val="24"/>
+                <w:bdr w:val="none" w:sz="0" w:space="0" w:color="auto" w:frame="1"/>
+                <w:lang w:val="en-US"/>
+              </w:rPr>
+              <w:t xml:space="preserve">., </w:t>
+            </w:r>
+            <w:proofErr w:type="spellStart"/>
+            <w:r>
+              <w:rPr>
+                <w:color w:val="1F1F1F"/>
+                <w:sz w:val="24"/>
+                <w:szCs w:val="24"/>
+                <w:bdr w:val="none" w:sz="0" w:space="0" w:color="auto" w:frame="1"/>
+                <w:lang w:val="en-US"/>
+              </w:rPr>
+              <w:t>kodni</w:t>
+            </w:r>
+            <w:proofErr w:type="spellEnd"/>
+            <w:r>
+              <w:rPr>
+                <w:color w:val="1F1F1F"/>
+                <w:sz w:val="24"/>
+                <w:szCs w:val="24"/>
+                <w:bdr w:val="none" w:sz="0" w:space="0" w:color="auto" w:frame="1"/>
+                <w:lang w:val="en-US"/>
+              </w:rPr>
+              <w:t xml:space="preserve"> </w:t>
+            </w:r>
+            <w:proofErr w:type="spellStart"/>
+            <w:r>
+              <w:rPr>
+                <w:color w:val="1F1F1F"/>
+                <w:sz w:val="24"/>
+                <w:szCs w:val="24"/>
+                <w:bdr w:val="none" w:sz="0" w:space="0" w:color="auto" w:frame="1"/>
+                <w:lang w:val="en-US"/>
+              </w:rPr>
+              <w:t>yozing</w:t>
+            </w:r>
+            <w:proofErr w:type="spellEnd"/>
+            <w:r>
+              <w:rPr>
+                <w:color w:val="1F1F1F"/>
+                <w:sz w:val="24"/>
+                <w:szCs w:val="24"/>
+                <w:bdr w:val="none" w:sz="0" w:space="0" w:color="auto" w:frame="1"/>
+                <w:lang w:val="en-US"/>
+              </w:rPr>
+              <w:t xml:space="preserve">, </w:t>
+            </w:r>
+            <w:proofErr w:type="spellStart"/>
             <w:r>
               <w:rPr>
                 <w:color w:val="1F1F1F"/>
@@ -35090,149 +35284,6 @@
                 <w:lang w:val="en-US"/>
               </w:rPr>
               <w:lastRenderedPageBreak/>
-              <w:t xml:space="preserve">Recognition) </w:t>
-            </w:r>
-            <w:proofErr w:type="spellStart"/>
-            <w:r>
-              <w:rPr>
-                <w:color w:val="1F1F1F"/>
-                <w:sz w:val="24"/>
-                <w:szCs w:val="24"/>
-                <w:bdr w:val="none" w:sz="0" w:space="0" w:color="auto" w:frame="1"/>
-                <w:lang w:val="en-US"/>
-              </w:rPr>
-              <w:t>vazifalarini</w:t>
-            </w:r>
-            <w:proofErr w:type="spellEnd"/>
-            <w:r>
-              <w:rPr>
-                <w:color w:val="1F1F1F"/>
-                <w:sz w:val="24"/>
-                <w:szCs w:val="24"/>
-                <w:bdr w:val="none" w:sz="0" w:space="0" w:color="auto" w:frame="1"/>
-                <w:lang w:val="en-US"/>
-              </w:rPr>
-              <w:t xml:space="preserve"> </w:t>
-            </w:r>
-            <w:proofErr w:type="spellStart"/>
-            <w:r>
-              <w:rPr>
-                <w:color w:val="1F1F1F"/>
-                <w:sz w:val="24"/>
-                <w:szCs w:val="24"/>
-                <w:bdr w:val="none" w:sz="0" w:space="0" w:color="auto" w:frame="1"/>
-                <w:lang w:val="en-US"/>
-              </w:rPr>
-              <w:t>bajarish</w:t>
-            </w:r>
-            <w:proofErr w:type="spellEnd"/>
-            <w:r>
-              <w:rPr>
-                <w:color w:val="1F1F1F"/>
-                <w:sz w:val="24"/>
-                <w:szCs w:val="24"/>
-                <w:bdr w:val="none" w:sz="0" w:space="0" w:color="auto" w:frame="1"/>
-                <w:lang w:val="en-US"/>
-              </w:rPr>
-              <w:t xml:space="preserve"> (</w:t>
-            </w:r>
-            <w:proofErr w:type="spellStart"/>
-            <w:r>
-              <w:rPr>
-                <w:color w:val="1F1F1F"/>
-                <w:sz w:val="24"/>
-                <w:szCs w:val="24"/>
-                <w:bdr w:val="none" w:sz="0" w:space="0" w:color="auto" w:frame="1"/>
-                <w:lang w:val="en-US"/>
-              </w:rPr>
-              <w:t>Natijani</w:t>
-            </w:r>
-            <w:proofErr w:type="spellEnd"/>
-            <w:r>
-              <w:rPr>
-                <w:color w:val="1F1F1F"/>
-                <w:sz w:val="24"/>
-                <w:szCs w:val="24"/>
-                <w:bdr w:val="none" w:sz="0" w:space="0" w:color="auto" w:frame="1"/>
-                <w:lang w:val="en-US"/>
-              </w:rPr>
-              <w:t xml:space="preserve"> </w:t>
-            </w:r>
-            <w:proofErr w:type="spellStart"/>
-            <w:r>
-              <w:rPr>
-                <w:color w:val="1F1F1F"/>
-                <w:sz w:val="24"/>
-                <w:szCs w:val="24"/>
-                <w:bdr w:val="none" w:sz="0" w:space="0" w:color="auto" w:frame="1"/>
-                <w:lang w:val="en-US"/>
-              </w:rPr>
-              <w:t>Prt.Scrn</w:t>
-            </w:r>
-            <w:proofErr w:type="spellEnd"/>
-            <w:r>
-              <w:rPr>
-                <w:color w:val="1F1F1F"/>
-                <w:sz w:val="24"/>
-                <w:szCs w:val="24"/>
-                <w:bdr w:val="none" w:sz="0" w:space="0" w:color="auto" w:frame="1"/>
-                <w:lang w:val="en-US"/>
-              </w:rPr>
-              <w:t xml:space="preserve">., </w:t>
-            </w:r>
-            <w:proofErr w:type="spellStart"/>
-            <w:r>
-              <w:rPr>
-                <w:color w:val="1F1F1F"/>
-                <w:sz w:val="24"/>
-                <w:szCs w:val="24"/>
-                <w:bdr w:val="none" w:sz="0" w:space="0" w:color="auto" w:frame="1"/>
-                <w:lang w:val="en-US"/>
-              </w:rPr>
-              <w:t>kodni</w:t>
-            </w:r>
-            <w:proofErr w:type="spellEnd"/>
-            <w:r>
-              <w:rPr>
-                <w:color w:val="1F1F1F"/>
-                <w:sz w:val="24"/>
-                <w:szCs w:val="24"/>
-                <w:bdr w:val="none" w:sz="0" w:space="0" w:color="auto" w:frame="1"/>
-                <w:lang w:val="en-US"/>
-              </w:rPr>
-              <w:t xml:space="preserve"> </w:t>
-            </w:r>
-            <w:proofErr w:type="spellStart"/>
-            <w:r>
-              <w:rPr>
-                <w:color w:val="1F1F1F"/>
-                <w:sz w:val="24"/>
-                <w:szCs w:val="24"/>
-                <w:bdr w:val="none" w:sz="0" w:space="0" w:color="auto" w:frame="1"/>
-                <w:lang w:val="en-US"/>
-              </w:rPr>
-              <w:t>yozing</w:t>
-            </w:r>
-            <w:proofErr w:type="spellEnd"/>
-            <w:r>
-              <w:rPr>
-                <w:color w:val="1F1F1F"/>
-                <w:sz w:val="24"/>
-                <w:szCs w:val="24"/>
-                <w:bdr w:val="none" w:sz="0" w:space="0" w:color="auto" w:frame="1"/>
-                <w:lang w:val="en-US"/>
-              </w:rPr>
-              <w:t xml:space="preserve">, </w:t>
-            </w:r>
-            <w:proofErr w:type="spellStart"/>
-            <w:r>
-              <w:rPr>
-                <w:color w:val="1F1F1F"/>
-                <w:sz w:val="24"/>
-                <w:szCs w:val="24"/>
-                <w:bdr w:val="none" w:sz="0" w:space="0" w:color="auto" w:frame="1"/>
-                <w:lang w:val="en-US"/>
-              </w:rPr>
               <w:t>izoh</w:t>
             </w:r>
             <w:proofErr w:type="spellEnd"/>
@@ -35344,6 +35395,7 @@
           </w:tcPr>
           <w:p>
             <w:pPr>
+              <w:widowControl w:val="0"/>
               <w:spacing w:after="0" w:line="240" w:lineRule="auto"/>
               <w:jc w:val="center"/>
               <w:rPr>
@@ -35374,6 +35426,7 @@
           </w:tcPr>
           <w:p>
             <w:pPr>
+              <w:widowControl w:val="0"/>
               <w:spacing w:after="0" w:line="240" w:lineRule="auto"/>
               <w:jc w:val="center"/>
               <w:rPr>
@@ -35401,6 +35454,7 @@
           </w:tcPr>
           <w:p>
             <w:pPr>
+              <w:widowControl w:val="0"/>
               <w:spacing w:after="0" w:line="240" w:lineRule="auto"/>
               <w:jc w:val="both"/>
               <w:rPr>
@@ -35849,6 +35903,7 @@
           </w:tcPr>
           <w:p>
             <w:pPr>
+              <w:widowControl w:val="0"/>
               <w:spacing w:after="0" w:line="240" w:lineRule="auto"/>
               <w:jc w:val="center"/>
               <w:rPr>
@@ -35878,6 +35933,7 @@
           </w:tcPr>
           <w:p>
             <w:pPr>
+              <w:widowControl w:val="0"/>
               <w:spacing w:after="0" w:line="240" w:lineRule="auto"/>
               <w:jc w:val="center"/>
               <w:rPr>
@@ -35905,6 +35961,7 @@
           </w:tcPr>
           <w:p>
             <w:pPr>
+              <w:widowControl w:val="0"/>
               <w:spacing w:after="0" w:line="240" w:lineRule="auto"/>
               <w:jc w:val="both"/>
               <w:rPr>
@@ -36463,6 +36520,7 @@
           </w:tcPr>
           <w:p>
             <w:pPr>
+              <w:widowControl w:val="0"/>
               <w:spacing w:after="0" w:line="240" w:lineRule="auto"/>
               <w:jc w:val="center"/>
               <w:rPr>
@@ -36488,6 +36546,7 @@
     </w:tbl>
     <w:p>
       <w:pPr>
+        <w:widowControl w:val="0"/>
         <w:spacing w:before="120" w:after="120" w:line="240" w:lineRule="auto"/>
         <w:ind w:firstLine="709"/>
         <w:rPr>
@@ -36512,7 +36571,7 @@
     <w:p>
       <w:pPr>
         <w:widowControl w:val="0"/>
-        <w:spacing w:after="0"/>
+        <w:spacing w:before="120" w:after="120"/>
         <w:jc w:val="center"/>
         <w:rPr>
           <w:b/>
@@ -36537,6 +36596,7 @@
     </w:p>
     <w:p>
       <w:pPr>
+        <w:widowControl w:val="0"/>
         <w:tabs>
           <w:tab w:val="num" w:pos="993"/>
         </w:tabs>
@@ -36555,11 +36615,12 @@
           <w:szCs w:val="26"/>
           <w:lang w:val="uz-Cyrl-UZ"/>
         </w:rPr>
-        <w:t>1. Sh.R. Sapayev, B.K. Yusupov, A.A.Abidov. “Python dasturlash tili” Darslik. Toshkent: 2024y. В - 316.</w:t>
+        <w:t>1. Sh.R. Sapayev, B.K. Yusupov, A.A.Abidov. “Python dasturlash tili” // Darslik. Toshkent: 2024y. В - 316.</w:t>
       </w:r>
     </w:p>
     <w:p>
       <w:pPr>
+        <w:widowControl w:val="0"/>
         <w:tabs>
           <w:tab w:val="num" w:pos="993"/>
         </w:tabs>
@@ -36576,135 +36637,14 @@
         <w:rPr>
           <w:sz w:val="26"/>
           <w:szCs w:val="26"/>
-          <w:lang w:val="en-US"/>
-        </w:rPr>
-        <w:t xml:space="preserve">2. </w:t>
-      </w:r>
-      <w:r>
-        <w:rPr>
-          <w:sz w:val="26"/>
-          <w:szCs w:val="26"/>
           <w:lang w:val="uz-Cyrl-UZ"/>
         </w:rPr>
-        <w:t>Sh.R. Sapayev “Python dasturlash</w:t>
-      </w:r>
-      <w:r>
-        <w:rPr>
-          <w:sz w:val="26"/>
-          <w:szCs w:val="26"/>
-          <w:lang w:val="en-US"/>
-        </w:rPr>
-        <w:t xml:space="preserve"> </w:t>
-      </w:r>
-      <w:proofErr w:type="spellStart"/>
-      <w:r>
-        <w:rPr>
-          <w:sz w:val="26"/>
-          <w:szCs w:val="26"/>
-          <w:lang w:val="en-US"/>
-        </w:rPr>
-        <w:t>tili</w:t>
-      </w:r>
-      <w:proofErr w:type="spellEnd"/>
-      <w:r>
-        <w:rPr>
-          <w:sz w:val="26"/>
-          <w:szCs w:val="26"/>
-          <w:lang w:val="uz-Cyrl-UZ"/>
-        </w:rPr>
-        <w:t xml:space="preserve"> </w:t>
-      </w:r>
-      <w:proofErr w:type="spellStart"/>
-      <w:r>
-        <w:rPr>
-          <w:sz w:val="26"/>
-          <w:szCs w:val="26"/>
-          <w:lang w:val="en-US"/>
-        </w:rPr>
-        <w:t>asoslari</w:t>
-      </w:r>
-      <w:proofErr w:type="spellEnd"/>
-      <w:r>
-        <w:rPr>
-          <w:sz w:val="26"/>
-          <w:szCs w:val="26"/>
-          <w:lang w:val="uz-Cyrl-UZ"/>
-        </w:rPr>
-        <w:t>”</w:t>
-      </w:r>
-      <w:r>
-        <w:rPr>
-          <w:sz w:val="26"/>
-          <w:szCs w:val="26"/>
-          <w:lang w:val="en-US"/>
-        </w:rPr>
-        <w:t xml:space="preserve">. </w:t>
-      </w:r>
-      <w:proofErr w:type="spellStart"/>
-      <w:proofErr w:type="gramStart"/>
-      <w:r>
-        <w:rPr>
-          <w:sz w:val="26"/>
-          <w:szCs w:val="26"/>
-          <w:lang w:val="en-US"/>
-        </w:rPr>
-        <w:t>O‘</w:t>
-      </w:r>
-      <w:proofErr w:type="gramEnd"/>
-      <w:r>
-        <w:rPr>
-          <w:sz w:val="26"/>
-          <w:szCs w:val="26"/>
-          <w:lang w:val="en-US"/>
-        </w:rPr>
-        <w:t>quv</w:t>
-      </w:r>
-      <w:proofErr w:type="spellEnd"/>
-      <w:r>
-        <w:rPr>
-          <w:sz w:val="26"/>
-          <w:szCs w:val="26"/>
-          <w:lang w:val="en-US"/>
-        </w:rPr>
-        <w:t xml:space="preserve"> </w:t>
-      </w:r>
-      <w:proofErr w:type="spellStart"/>
-      <w:r>
-        <w:rPr>
-          <w:sz w:val="26"/>
-          <w:szCs w:val="26"/>
-          <w:lang w:val="en-US"/>
-        </w:rPr>
-        <w:t>qo‘llanma</w:t>
-      </w:r>
-      <w:proofErr w:type="spellEnd"/>
-      <w:r>
-        <w:rPr>
-          <w:sz w:val="26"/>
-          <w:szCs w:val="26"/>
-          <w:lang w:val="uz-Cyrl-UZ"/>
-        </w:rPr>
-        <w:t>. Toshkent: 202</w:t>
-      </w:r>
-      <w:r>
-        <w:rPr>
-          <w:sz w:val="26"/>
-          <w:szCs w:val="26"/>
-          <w:lang w:val="en-US"/>
-        </w:rPr>
-        <w:t>3</w:t>
-      </w:r>
-      <w:r>
-        <w:rPr>
-          <w:sz w:val="26"/>
-          <w:szCs w:val="26"/>
-          <w:lang w:val="uz-Cyrl-UZ"/>
-        </w:rPr>
-        <w:t>y. В – 137.</w:t>
+        <w:t>2. Sh.R. Sapayev “Python dasturlash tili asoslari”. // O‘quv qo‘llanma. Toshkent: 2023y. В – 137.</w:t>
       </w:r>
     </w:p>
     <w:p>
       <w:pPr>
+        <w:widowControl w:val="0"/>
         <w:tabs>
           <w:tab w:val="num" w:pos="993"/>
         </w:tabs>
@@ -36723,147 +36663,20 @@
           <w:szCs w:val="26"/>
           <w:lang w:val="uz-Cyrl-UZ"/>
         </w:rPr>
-        <w:t xml:space="preserve">3. B.K. Yusupov, M.M. Isakov, A.A. Komilov, R.O‘. </w:t>
-      </w:r>
-      <w:proofErr w:type="spellStart"/>
+        <w:t xml:space="preserve">3. B.K. Yusupov, M.M. Isakov, A.A. Komilov, R.O‘. Qodomboyev. “Sun’iy intellekt asoslari (NumPy kutubxonasi)”. // O‘quv qo‘llanma. </w:t>
+      </w:r>
       <w:r>
         <w:rPr>
           <w:sz w:val="26"/>
           <w:szCs w:val="26"/>
           <w:lang w:val="en-US"/>
         </w:rPr>
-        <w:t>Qodomboyev</w:t>
-      </w:r>
-      <w:proofErr w:type="spellEnd"/>
-      <w:r>
-        <w:rPr>
-          <w:sz w:val="26"/>
-          <w:szCs w:val="26"/>
-          <w:lang w:val="en-US"/>
-        </w:rPr>
-        <w:t>. “</w:t>
-      </w:r>
-      <w:proofErr w:type="spellStart"/>
-      <w:r>
-        <w:rPr>
-          <w:sz w:val="26"/>
-          <w:szCs w:val="26"/>
-          <w:lang w:val="en-US"/>
-        </w:rPr>
-        <w:t>Sun’iy</w:t>
-      </w:r>
-      <w:proofErr w:type="spellEnd"/>
-      <w:r>
-        <w:rPr>
-          <w:sz w:val="26"/>
-          <w:szCs w:val="26"/>
-          <w:lang w:val="en-US"/>
-        </w:rPr>
-        <w:t xml:space="preserve"> </w:t>
-      </w:r>
-      <w:proofErr w:type="spellStart"/>
-      <w:r>
-        <w:rPr>
-          <w:sz w:val="26"/>
-          <w:szCs w:val="26"/>
-          <w:lang w:val="en-US"/>
-        </w:rPr>
-        <w:t>intellekt</w:t>
-      </w:r>
-      <w:proofErr w:type="spellEnd"/>
-      <w:r>
-        <w:rPr>
-          <w:sz w:val="26"/>
-          <w:szCs w:val="26"/>
-          <w:lang w:val="en-US"/>
-        </w:rPr>
-        <w:t xml:space="preserve"> </w:t>
-      </w:r>
-      <w:proofErr w:type="spellStart"/>
-      <w:r>
-        <w:rPr>
-          <w:sz w:val="26"/>
-          <w:szCs w:val="26"/>
-          <w:lang w:val="en-US"/>
-        </w:rPr>
-        <w:t>asoslari</w:t>
-      </w:r>
-      <w:proofErr w:type="spellEnd"/>
-      <w:r>
-        <w:rPr>
-          <w:sz w:val="26"/>
-          <w:szCs w:val="26"/>
-          <w:lang w:val="en-US"/>
-        </w:rPr>
-        <w:t xml:space="preserve"> (NumPy </w:t>
-      </w:r>
-      <w:proofErr w:type="spellStart"/>
-      <w:r>
-        <w:rPr>
-          <w:sz w:val="26"/>
-          <w:szCs w:val="26"/>
-          <w:lang w:val="en-US"/>
-        </w:rPr>
-        <w:t>kutubxonasi</w:t>
-      </w:r>
-      <w:proofErr w:type="spellEnd"/>
-      <w:r>
-        <w:rPr>
-          <w:sz w:val="26"/>
-          <w:szCs w:val="26"/>
-          <w:lang w:val="en-US"/>
-        </w:rPr>
-        <w:t xml:space="preserve">)”. </w:t>
-      </w:r>
-      <w:proofErr w:type="spellStart"/>
-      <w:proofErr w:type="gramStart"/>
-      <w:r>
-        <w:rPr>
-          <w:sz w:val="26"/>
-          <w:szCs w:val="26"/>
-          <w:lang w:val="en-US"/>
-        </w:rPr>
-        <w:t>O‘</w:t>
-      </w:r>
-      <w:proofErr w:type="gramEnd"/>
-      <w:r>
-        <w:rPr>
-          <w:sz w:val="26"/>
-          <w:szCs w:val="26"/>
-          <w:lang w:val="en-US"/>
-        </w:rPr>
-        <w:t>quv</w:t>
-      </w:r>
-      <w:proofErr w:type="spellEnd"/>
-      <w:r>
-        <w:rPr>
-          <w:sz w:val="26"/>
-          <w:szCs w:val="26"/>
-          <w:lang w:val="en-US"/>
-        </w:rPr>
-        <w:t xml:space="preserve"> </w:t>
-      </w:r>
-      <w:proofErr w:type="spellStart"/>
-      <w:r>
-        <w:rPr>
-          <w:sz w:val="26"/>
-          <w:szCs w:val="26"/>
-          <w:lang w:val="en-US"/>
-        </w:rPr>
-        <w:t>qo‘llanma</w:t>
-      </w:r>
-      <w:proofErr w:type="spellEnd"/>
-      <w:r>
-        <w:rPr>
-          <w:sz w:val="26"/>
-          <w:szCs w:val="26"/>
-          <w:lang w:val="en-US"/>
-        </w:rPr>
-        <w:t>. Toshkent:2026-y. B – 208.</w:t>
+        <w:t>Toshkent: 2026-y. B – 208.</w:t>
       </w:r>
     </w:p>
     <w:p>
       <w:pPr>
+        <w:widowControl w:val="0"/>
         <w:tabs>
           <w:tab w:val="num" w:pos="993"/>
         </w:tabs>
@@ -36900,23 +36713,50 @@
           <w:szCs w:val="26"/>
           <w:lang w:val="en-US"/>
         </w:rPr>
-        <w:t xml:space="preserve">. “Dive into Deep Learning”. Cambridge University Press: 2023-y. URL: </w:t>
-      </w:r>
-      <w:hyperlink r:id="rId5" w:history="1">
-        <w:r>
-          <w:rPr>
-            <w:color w:val="0563C1"/>
-            <w:sz w:val="26"/>
-            <w:szCs w:val="26"/>
-            <w:u w:val="single"/>
-            <w:lang w:val="en-US"/>
-          </w:rPr>
-          <w:t>https://d2l.ai/</w:t>
-        </w:r>
-      </w:hyperlink>
+        <w:t xml:space="preserve">. “Dive into Deep Learning”. // Cambridge University Press: 2023-y. 982 p. URL: </w:t>
+      </w:r>
+      <w:r>
+        <w:rPr>
+          <w:sz w:val="26"/>
+          <w:szCs w:val="26"/>
+        </w:rPr>
+        <w:fldChar w:fldCharType="begin"/>
+      </w:r>
+      <w:r>
+        <w:rPr>
+          <w:sz w:val="26"/>
+          <w:szCs w:val="26"/>
+          <w:lang w:val="en-US"/>
+        </w:rPr>
+        <w:instrText xml:space="preserve"> HYPERLINK "https://d2l.ai/" </w:instrText>
+      </w:r>
+      <w:r>
+        <w:rPr>
+          <w:sz w:val="26"/>
+          <w:szCs w:val="26"/>
+        </w:rPr>
+        <w:fldChar w:fldCharType="separate"/>
+      </w:r>
+      <w:r>
+        <w:rPr>
+          <w:sz w:val="26"/>
+          <w:szCs w:val="26"/>
+          <w:lang w:val="en-US"/>
+        </w:rPr>
+        <w:t>https://d2l.ai/</w:t>
+      </w:r>
+      <w:r>
+        <w:rPr>
+          <w:sz w:val="26"/>
+          <w:szCs w:val="26"/>
+          <w:lang w:val="en-US"/>
+        </w:rPr>
+        <w:fldChar w:fldCharType="end"/>
+      </w:r>
     </w:p>
     <w:p>
       <w:pPr>
+        <w:widowControl w:val="0"/>
         <w:tabs>
           <w:tab w:val="num" w:pos="993"/>
         </w:tabs>
@@ -36953,30 +36793,60 @@
           <w:szCs w:val="26"/>
           <w:lang w:val="en-US"/>
         </w:rPr>
-        <w:t xml:space="preserve">, J. Taylor. “An Introduction to Statistical Learning with Applications in Python”. Springer: 2023-y. B - 607. URL: </w:t>
-      </w:r>
-      <w:hyperlink r:id="rId6" w:history="1">
-        <w:r>
-          <w:rPr>
-            <w:color w:val="0563C1"/>
-            <w:sz w:val="26"/>
-            <w:szCs w:val="26"/>
-            <w:u w:val="single"/>
-            <w:lang w:val="en-US"/>
-          </w:rPr>
-          <w:t>https://www.statlearning.com/</w:t>
-        </w:r>
-      </w:hyperlink>
+        <w:t xml:space="preserve">, J. Taylor. “An Introduction to Statistical Learning with Applications in Python”. // Springer: 2023-y. 607 p. URL: </w:t>
+      </w:r>
+      <w:r>
+        <w:rPr>
+          <w:sz w:val="26"/>
+          <w:szCs w:val="26"/>
+        </w:rPr>
+        <w:fldChar w:fldCharType="begin"/>
+      </w:r>
+      <w:r>
+        <w:rPr>
+          <w:sz w:val="26"/>
+          <w:szCs w:val="26"/>
+          <w:lang w:val="en-US"/>
+        </w:rPr>
+        <w:instrText xml:space="preserve"> HYPERLINK "https://www.statlearning.com/" </w:instrText>
+      </w:r>
+      <w:r>
+        <w:rPr>
+          <w:sz w:val="26"/>
+          <w:szCs w:val="26"/>
+        </w:rPr>
+        <w:fldChar w:fldCharType="separate"/>
+      </w:r>
+      <w:r>
+        <w:rPr>
+          <w:sz w:val="26"/>
+          <w:szCs w:val="26"/>
+          <w:lang w:val="en-US"/>
+        </w:rPr>
+        <w:t>https://www.statlearning.com/</w:t>
+      </w:r>
+      <w:r>
+        <w:rPr>
+          <w:sz w:val="26"/>
+          <w:szCs w:val="26"/>
+          <w:lang w:val="en-US"/>
+        </w:rPr>
+        <w:fldChar w:fldCharType="end"/>
+      </w:r>
     </w:p>
     <w:p>
       <w:pPr>
         <w:pStyle w:val="3"/>
+        <w:keepNext w:val="0"/>
+        <w:keepLines w:val="0"/>
+        <w:widowControl w:val="0"/>
+        <w:spacing w:before="120" w:after="120"/>
         <w:jc w:val="center"/>
         <w:rPr>
           <w:rFonts w:ascii="Times New Roman" w:hAnsi="Times New Roman"/>
           <w:b w:val="0"/>
           <w:bCs w:val="0"/>
-          <w:color w:val="1F1F1F"/>
+          <w:color w:val="auto"/>
           <w:sz w:val="26"/>
           <w:szCs w:val="26"/>
           <w:lang w:val="en-US"/>
@@ -36987,7 +36857,7 @@
       <w:r>
         <w:rPr>
           <w:rFonts w:ascii="Times New Roman" w:hAnsi="Times New Roman"/>
-          <w:color w:val="1F1F1F"/>
+          <w:color w:val="auto"/>
           <w:sz w:val="26"/>
           <w:szCs w:val="26"/>
           <w:bdr w:val="none" w:sz="0" w:space="0" w:color="auto" w:frame="1"/>
@@ -36999,7 +36869,7 @@
       <w:r>
         <w:rPr>
           <w:rFonts w:ascii="Times New Roman" w:hAnsi="Times New Roman"/>
-          <w:color w:val="1F1F1F"/>
+          <w:color w:val="auto"/>
           <w:sz w:val="26"/>
           <w:szCs w:val="26"/>
           <w:bdr w:val="none" w:sz="0" w:space="0" w:color="auto" w:frame="1"/>
@@ -37011,7 +36881,7 @@
       <w:r>
         <w:rPr>
           <w:rFonts w:ascii="Times New Roman" w:hAnsi="Times New Roman"/>
-          <w:color w:val="1F1F1F"/>
+          <w:color w:val="auto"/>
           <w:sz w:val="26"/>
           <w:szCs w:val="26"/>
           <w:bdr w:val="none" w:sz="0" w:space="0" w:color="auto" w:frame="1"/>
@@ -37023,7 +36893,7 @@
       <w:r>
         <w:rPr>
           <w:rFonts w:ascii="Times New Roman" w:hAnsi="Times New Roman"/>
-          <w:color w:val="1F1F1F"/>
+          <w:color w:val="auto"/>
           <w:sz w:val="26"/>
           <w:szCs w:val="26"/>
           <w:bdr w:val="none" w:sz="0" w:space="0" w:color="auto" w:frame="1"/>
@@ -37035,7 +36905,7 @@
       <w:r>
         <w:rPr>
           <w:rFonts w:ascii="Times New Roman" w:hAnsi="Times New Roman"/>
-          <w:color w:val="1F1F1F"/>
+          <w:color w:val="auto"/>
           <w:sz w:val="26"/>
           <w:szCs w:val="26"/>
           <w:bdr w:val="none" w:sz="0" w:space="0" w:color="auto" w:frame="1"/>
@@ -37046,6 +36916,7 @@
     </w:p>
     <w:p>
       <w:pPr>
+        <w:widowControl w:val="0"/>
         <w:spacing w:after="0"/>
         <w:ind w:firstLine="709"/>
         <w:jc w:val="both"/>
@@ -37057,7 +36928,6 @@
       </w:pPr>
       <w:r>
         <w:rPr>
-          <w:color w:val="1F1F1F"/>
           <w:sz w:val="26"/>
           <w:szCs w:val="26"/>
           <w:bdr w:val="none" w:sz="0" w:space="0" w:color="auto" w:frame="1"/>
@@ -37071,7 +36941,7 @@
           <w:szCs w:val="26"/>
           <w:lang w:val="en-US"/>
         </w:rPr>
-        <w:t xml:space="preserve">S.J.D. Prince. “Understanding Deep Learning”. The MIT Press: 2023-y. </w:t>
+        <w:t xml:space="preserve">S.J.D. Prince. “Understanding Deep Learning”. // The MIT Press: 2023-y. </w:t>
       </w:r>
       <w:r>
         <w:rPr>
@@ -37080,24 +36950,51 @@
           <w:lang w:val="en-US"/>
         </w:rPr>
         <w:br/>
-        <w:t xml:space="preserve">B - 541. URL: </w:t>
-      </w:r>
-      <w:hyperlink r:id="rId7" w:history="1">
-        <w:r>
-          <w:rPr>
-            <w:color w:val="0563C1"/>
-            <w:sz w:val="26"/>
-            <w:szCs w:val="26"/>
-            <w:u w:val="single"/>
-            <w:lang w:val="en-US"/>
-          </w:rPr>
-          <w:t>https://udlbook.github.io/udlbook/</w:t>
-        </w:r>
-      </w:hyperlink>
+        <w:t xml:space="preserve">541 p. URL: </w:t>
+      </w:r>
+      <w:r>
+        <w:rPr>
+          <w:sz w:val="26"/>
+          <w:szCs w:val="26"/>
+        </w:rPr>
+        <w:fldChar w:fldCharType="begin"/>
+      </w:r>
+      <w:r>
+        <w:rPr>
+          <w:sz w:val="26"/>
+          <w:szCs w:val="26"/>
+          <w:lang w:val="en-US"/>
+        </w:rPr>
+        <w:instrText xml:space="preserve"> HYPERLINK "https://udlbook.github.io/udlbook/" </w:instrText>
+      </w:r>
+      <w:r>
+        <w:rPr>
+          <w:sz w:val="26"/>
+          <w:szCs w:val="26"/>
+        </w:rPr>
+        <w:fldChar w:fldCharType="separate"/>
+      </w:r>
+      <w:r>
+        <w:rPr>
+          <w:sz w:val="26"/>
+          <w:szCs w:val="26"/>
+          <w:lang w:val="en-US"/>
+        </w:rPr>
+        <w:t>https://udlbook.github.io/udlbook/</w:t>
+      </w:r>
+      <w:r>
+        <w:rPr>
+          <w:sz w:val="26"/>
+          <w:szCs w:val="26"/>
+          <w:lang w:val="en-US"/>
+        </w:rPr>
+        <w:fldChar w:fldCharType="end"/>
+      </w:r>
     </w:p>
     <w:p>
       <w:pPr>
         <w:pStyle w:val="a6"/>
+        <w:widowControl w:val="0"/>
         <w:spacing w:line="276" w:lineRule="auto"/>
         <w:ind w:left="0" w:firstLine="709"/>
         <w:contextualSpacing w:val="0"/>
@@ -37130,22 +37027,35 @@
           <w:szCs w:val="26"/>
           <w:lang w:val="en-US"/>
         </w:rPr>
-        <w:t xml:space="preserve">, J.H. Martin. “Speech and Language Processing: An Introduction to Natural Language Processing, Computational Linguistics, and Speech Recognition with Language Models” (3-nashr). </w:t>
-      </w:r>
-      <w:r>
-        <w:rPr>
-          <w:sz w:val="26"/>
-          <w:szCs w:val="26"/>
-        </w:rPr>
-        <w:t xml:space="preserve">2025-y. URL: </w:t>
-      </w:r>
-      <w:hyperlink r:id="rId8" w:history="1">
+        <w:t xml:space="preserve">, J.H. Martin. “Speech and Language Processing: An Introduction to Natural Language Processing, Computational Linguistics, and Speech Recognition with Language Models” // (3-nashr). </w:t>
+      </w:r>
+      <w:r>
+        <w:rPr>
+          <w:sz w:val="26"/>
+          <w:szCs w:val="26"/>
+        </w:rPr>
+        <w:t xml:space="preserve">2025-y. </w:t>
+      </w:r>
+      <w:r>
+        <w:rPr>
+          <w:sz w:val="26"/>
+          <w:szCs w:val="26"/>
+          <w:lang w:val="en-US"/>
+        </w:rPr>
+        <w:t xml:space="preserve">326 p. </w:t>
+      </w:r>
+      <w:r>
+        <w:rPr>
+          <w:sz w:val="26"/>
+          <w:szCs w:val="26"/>
+        </w:rPr>
+        <w:t xml:space="preserve">URL: </w:t>
+      </w:r>
+      <w:hyperlink r:id="rId5" w:history="1">
         <w:r>
           <w:rPr>
-            <w:color w:val="0563C1"/>
             <w:sz w:val="26"/>
             <w:szCs w:val="26"/>
-            <w:u w:val="single"/>
           </w:rPr>
           <w:t>https://web.stanford.edu/~jurafsky/slp3/</w:t>
         </w:r>
@@ -37154,6 +37064,7 @@
     <w:p>
       <w:pPr>
         <w:pStyle w:val="a6"/>
+        <w:widowControl w:val="0"/>
         <w:spacing w:line="276" w:lineRule="auto"/>
         <w:ind w:left="0" w:firstLine="709"/>
         <w:contextualSpacing w:val="0"/>
@@ -37169,15 +37080,13 @@
           <w:szCs w:val="26"/>
           <w:lang w:val="en-US"/>
         </w:rPr>
-        <w:t xml:space="preserve">3. K.P. Murphy. “Probabilistic Machine Learning: An Introduction”. The MIT Press: 2022-y. URL: </w:t>
-      </w:r>
-      <w:hyperlink r:id="rId9" w:history="1">
+        <w:t xml:space="preserve">3. K.P. Murphy. “Probabilistic Machine Learning: An Introduction”. // The MIT Press: 2022-y. - 860 p. URL: </w:t>
+      </w:r>
+      <w:hyperlink r:id="rId6" w:history="1">
         <w:r>
           <w:rPr>
-            <w:color w:val="0563C1"/>
             <w:sz w:val="26"/>
             <w:szCs w:val="26"/>
-            <w:u w:val="single"/>
             <w:lang w:val="en-US"/>
           </w:rPr>
           <w:t>https://probml.github.io/pml-book/book1.html</w:t>
@@ -37186,11 +37095,11 @@
     </w:p>
     <w:p>
       <w:pPr>
+        <w:widowControl w:val="0"/>
         <w:spacing w:after="0"/>
         <w:ind w:firstLine="709"/>
         <w:jc w:val="both"/>
         <w:rPr>
-          <w:color w:val="1F1F1F"/>
           <w:sz w:val="26"/>
           <w:szCs w:val="26"/>
           <w:bdr w:val="none" w:sz="0" w:space="0" w:color="auto" w:frame="1"/>
@@ -37199,7 +37108,6 @@
       </w:pPr>
       <w:r>
         <w:rPr>
-          <w:color w:val="1F1F1F"/>
           <w:sz w:val="26"/>
           <w:szCs w:val="26"/>
           <w:bdr w:val="none" w:sz="0" w:space="0" w:color="auto" w:frame="1"/>
@@ -37210,7 +37118,6 @@
       <w:proofErr w:type="spellStart"/>
       <w:r>
         <w:rPr>
-          <w:color w:val="1F1F1F"/>
           <w:sz w:val="26"/>
           <w:szCs w:val="26"/>
           <w:bdr w:val="none" w:sz="0" w:space="0" w:color="auto" w:frame="1"/>
@@ -37221,7 +37128,6 @@
       <w:proofErr w:type="spellEnd"/>
       <w:r>
         <w:rPr>
-          <w:color w:val="1F1F1F"/>
           <w:sz w:val="26"/>
           <w:szCs w:val="26"/>
           <w:bdr w:val="none" w:sz="0" w:space="0" w:color="auto" w:frame="1"/>
@@ -37232,7 +37138,6 @@
       <w:proofErr w:type="spellStart"/>
       <w:r>
         <w:rPr>
-          <w:color w:val="1F1F1F"/>
           <w:sz w:val="26"/>
           <w:szCs w:val="26"/>
           <w:bdr w:val="none" w:sz="0" w:space="0" w:color="auto" w:frame="1"/>
@@ -37243,18 +37148,16 @@
       <w:proofErr w:type="spellEnd"/>
       <w:r>
         <w:rPr>
-          <w:color w:val="1F1F1F"/>
           <w:sz w:val="26"/>
           <w:szCs w:val="26"/>
           <w:bdr w:val="none" w:sz="0" w:space="0" w:color="auto" w:frame="1"/>
           <w:lang w:val="en-US"/>
         </w:rPr>
-        <w:t xml:space="preserve">, and TensorFlow. 3rd Edition. Sebastopol, CA: </w:t>
+        <w:t xml:space="preserve">, and TensorFlow. // 3rd Edition. Sebastopol, CA: </w:t>
       </w:r>
       <w:proofErr w:type="gramStart"/>
       <w:r>
         <w:rPr>
-          <w:color w:val="1F1F1F"/>
           <w:sz w:val="26"/>
           <w:szCs w:val="26"/>
           <w:bdr w:val="none" w:sz="0" w:space="0" w:color="auto" w:frame="1"/>
@@ -37265,25 +37168,27 @@
       <w:proofErr w:type="gramEnd"/>
       <w:r>
         <w:rPr>
-          <w:color w:val="1F1F1F"/>
           <w:sz w:val="26"/>
           <w:szCs w:val="26"/>
           <w:bdr w:val="none" w:sz="0" w:space="0" w:color="auto" w:frame="1"/>
           <w:lang w:val="en-US"/>
         </w:rPr>
-        <w:t>Reilly Media, 2022. – 856 p.</w:t>
+        <w:t>Reilly Media, 2022. – 851 p.</w:t>
       </w:r>
     </w:p>
     <w:p>
       <w:pPr>
         <w:pStyle w:val="3"/>
-        <w:spacing w:before="240"/>
+        <w:keepNext w:val="0"/>
+        <w:keepLines w:val="0"/>
+        <w:widowControl w:val="0"/>
+        <w:spacing w:before="120" w:after="120"/>
         <w:jc w:val="center"/>
         <w:rPr>
           <w:rFonts w:ascii="Times New Roman" w:hAnsi="Times New Roman"/>
           <w:b w:val="0"/>
           <w:bCs w:val="0"/>
-          <w:color w:val="1F1F1F"/>
+          <w:color w:val="auto"/>
           <w:sz w:val="26"/>
           <w:szCs w:val="26"/>
           <w:lang w:val="en-US"/>
@@ -37292,7 +37197,7 @@
       <w:r>
         <w:rPr>
           <w:rFonts w:ascii="Times New Roman" w:hAnsi="Times New Roman"/>
-          <w:color w:val="1F1F1F"/>
+          <w:color w:val="auto"/>
           <w:sz w:val="26"/>
           <w:szCs w:val="26"/>
           <w:bdr w:val="none" w:sz="0" w:space="0" w:color="auto" w:frame="1"/>
@@ -37304,7 +37209,7 @@
       <w:r>
         <w:rPr>
           <w:rFonts w:ascii="Times New Roman" w:hAnsi="Times New Roman"/>
-          <w:color w:val="1F1F1F"/>
+          <w:color w:val="auto"/>
           <w:sz w:val="26"/>
           <w:szCs w:val="26"/>
           <w:bdr w:val="none" w:sz="0" w:space="0" w:color="auto" w:frame="1"/>
@@ -37316,7 +37221,7 @@
       <w:r>
         <w:rPr>
           <w:rFonts w:ascii="Times New Roman" w:hAnsi="Times New Roman"/>
-          <w:color w:val="1F1F1F"/>
+          <w:color w:val="auto"/>
           <w:sz w:val="26"/>
           <w:szCs w:val="26"/>
           <w:bdr w:val="none" w:sz="0" w:space="0" w:color="auto" w:frame="1"/>
@@ -37327,6 +37232,7 @@
     </w:p>
     <w:p>
       <w:pPr>
+        <w:widowControl w:val="0"/>
         <w:spacing w:after="0"/>
         <w:ind w:firstLine="709"/>
         <w:jc w:val="both"/>
@@ -37344,17 +37250,50 @@
         </w:rPr>
         <w:t xml:space="preserve">1. </w:t>
       </w:r>
-      <w:hyperlink r:id="rId10" w:history="1">
-        <w:r>
-          <w:rPr>
-            <w:rStyle w:val="a8"/>
-            <w:sz w:val="26"/>
-            <w:szCs w:val="26"/>
-            <w:lang w:val="en-US"/>
-          </w:rPr>
-          <w:t>https://huggingface.co</w:t>
-        </w:r>
-      </w:hyperlink>
+      <w:r>
+        <w:rPr>
+          <w:sz w:val="26"/>
+          <w:szCs w:val="26"/>
+        </w:rPr>
+        <w:fldChar w:fldCharType="begin"/>
+      </w:r>
+      <w:r>
+        <w:rPr>
+          <w:sz w:val="26"/>
+          <w:szCs w:val="26"/>
+          <w:lang w:val="en-US"/>
+        </w:rPr>
+        <w:instrText xml:space="preserve"> HYPERLINK "https://huggingface.co" </w:instrText>
+      </w:r>
+      <w:r>
+        <w:rPr>
+          <w:sz w:val="26"/>
+          <w:szCs w:val="26"/>
+        </w:rPr>
+        <w:fldChar w:fldCharType="separate"/>
+      </w:r>
+      <w:r>
+        <w:rPr>
+          <w:rStyle w:val="a8"/>
+          <w:color w:val="auto"/>
+          <w:sz w:val="26"/>
+          <w:szCs w:val="26"/>
+          <w:u w:val="none"/>
+          <w:lang w:val="en-US"/>
+        </w:rPr>
+        <w:t>https://huggingface.co</w:t>
+      </w:r>
+      <w:r>
+        <w:rPr>
+          <w:rStyle w:val="a8"/>
+          <w:color w:val="auto"/>
+          <w:sz w:val="26"/>
+          <w:szCs w:val="26"/>
+          <w:u w:val="none"/>
+          <w:lang w:val="en-US"/>
+        </w:rPr>
+        <w:fldChar w:fldCharType="end"/>
+      </w:r>
       <w:r>
         <w:rPr>
           <w:sz w:val="26"/>
@@ -37510,6 +37449,7 @@
     </w:p>
     <w:p>
       <w:pPr>
+        <w:widowControl w:val="0"/>
         <w:spacing w:after="0"/>
         <w:ind w:firstLine="709"/>
         <w:jc w:val="both"/>
@@ -37527,17 +37467,50 @@
         </w:rPr>
         <w:t xml:space="preserve">2. </w:t>
       </w:r>
-      <w:hyperlink r:id="rId11" w:history="1">
-        <w:r>
-          <w:rPr>
-            <w:rStyle w:val="a8"/>
-            <w:sz w:val="26"/>
-            <w:szCs w:val="26"/>
-            <w:lang w:val="en-US"/>
-          </w:rPr>
-          <w:t>https://www.kaggle.com</w:t>
-        </w:r>
-      </w:hyperlink>
+      <w:r>
+        <w:rPr>
+          <w:sz w:val="26"/>
+          <w:szCs w:val="26"/>
+        </w:rPr>
+        <w:fldChar w:fldCharType="begin"/>
+      </w:r>
+      <w:r>
+        <w:rPr>
+          <w:sz w:val="26"/>
+          <w:szCs w:val="26"/>
+          <w:lang w:val="en-US"/>
+        </w:rPr>
+        <w:instrText xml:space="preserve"> HYPERLINK "https://www.kaggle.com" </w:instrText>
+      </w:r>
+      <w:r>
+        <w:rPr>
+          <w:sz w:val="26"/>
+          <w:szCs w:val="26"/>
+        </w:rPr>
+        <w:fldChar w:fldCharType="separate"/>
+      </w:r>
+      <w:r>
+        <w:rPr>
+          <w:rStyle w:val="a8"/>
+          <w:color w:val="auto"/>
+          <w:sz w:val="26"/>
+          <w:szCs w:val="26"/>
+          <w:u w:val="none"/>
+          <w:lang w:val="en-US"/>
+        </w:rPr>
+        <w:t>https://www.kaggle.com</w:t>
+      </w:r>
+      <w:r>
+        <w:rPr>
+          <w:rStyle w:val="a8"/>
+          <w:color w:val="auto"/>
+          <w:sz w:val="26"/>
+          <w:szCs w:val="26"/>
+          <w:u w:val="none"/>
+          <w:lang w:val="en-US"/>
+        </w:rPr>
+        <w:fldChar w:fldCharType="end"/>
+      </w:r>
       <w:r>
         <w:rPr>
           <w:sz w:val="26"/>
@@ -37739,6 +37712,7 @@
     </w:p>
     <w:p>
       <w:pPr>
+        <w:widowControl w:val="0"/>
         <w:spacing w:after="0"/>
         <w:ind w:firstLine="709"/>
         <w:jc w:val="both"/>
@@ -37756,37 +37730,96 @@
         </w:rPr>
         <w:t xml:space="preserve">3. </w:t>
       </w:r>
-      <w:hyperlink r:id="rId12" w:history="1">
-        <w:r>
-          <w:rPr>
-            <w:rStyle w:val="a8"/>
-            <w:sz w:val="26"/>
-            <w:szCs w:val="26"/>
-            <w:lang w:val="en-US"/>
-          </w:rPr>
-          <w:t>https://www.deeplearning.ai</w:t>
-        </w:r>
-      </w:hyperlink>
+      <w:r>
+        <w:rPr>
+          <w:sz w:val="26"/>
+          <w:szCs w:val="26"/>
+        </w:rPr>
+        <w:fldChar w:fldCharType="begin"/>
+      </w:r>
       <w:r>
         <w:rPr>
           <w:sz w:val="26"/>
           <w:szCs w:val="26"/>
           <w:lang w:val="en-US"/>
         </w:rPr>
+        <w:instrText xml:space="preserve"> HYPERLINK "https://www.deeplearning.ai" </w:instrText>
+      </w:r>
+      <w:r>
+        <w:rPr>
+          <w:sz w:val="26"/>
+          <w:szCs w:val="26"/>
+        </w:rPr>
+        <w:fldChar w:fldCharType="separate"/>
+      </w:r>
+      <w:r>
+        <w:rPr>
+          <w:rStyle w:val="a8"/>
+          <w:color w:val="auto"/>
+          <w:sz w:val="26"/>
+          <w:szCs w:val="26"/>
+          <w:u w:val="none"/>
+          <w:lang w:val="en-US"/>
+        </w:rPr>
+        <w:t>https://www.deeplearning.ai</w:t>
+      </w:r>
+      <w:r>
+        <w:rPr>
+          <w:rStyle w:val="a8"/>
+          <w:color w:val="auto"/>
+          <w:sz w:val="26"/>
+          <w:szCs w:val="26"/>
+          <w:u w:val="none"/>
+          <w:lang w:val="en-US"/>
+        </w:rPr>
+        <w:fldChar w:fldCharType="end"/>
+      </w:r>
+      <w:r>
+        <w:rPr>
+          <w:sz w:val="26"/>
+          <w:szCs w:val="26"/>
+          <w:lang w:val="en-US"/>
+        </w:rPr>
         <w:t xml:space="preserve"> / </w:t>
       </w:r>
-      <w:hyperlink r:id="rId13" w:history="1">
-        <w:r>
-          <w:rPr>
-            <w:color w:val="0563C1"/>
-            <w:sz w:val="26"/>
-            <w:szCs w:val="26"/>
-            <w:u w:val="single"/>
-            <w:lang w:val="en-US"/>
-          </w:rPr>
-          <w:t>https://www.coursera.org</w:t>
-        </w:r>
-      </w:hyperlink>
+      <w:r>
+        <w:rPr>
+          <w:sz w:val="26"/>
+          <w:szCs w:val="26"/>
+        </w:rPr>
+        <w:fldChar w:fldCharType="begin"/>
+      </w:r>
+      <w:r>
+        <w:rPr>
+          <w:sz w:val="26"/>
+          <w:szCs w:val="26"/>
+          <w:lang w:val="en-US"/>
+        </w:rPr>
+        <w:instrText xml:space="preserve"> HYPERLINK "https://www.coursera.org" </w:instrText>
+      </w:r>
+      <w:r>
+        <w:rPr>
+          <w:sz w:val="26"/>
+          <w:szCs w:val="26"/>
+        </w:rPr>
+        <w:fldChar w:fldCharType="separate"/>
+      </w:r>
+      <w:r>
+        <w:rPr>
+          <w:sz w:val="26"/>
+          <w:szCs w:val="26"/>
+          <w:lang w:val="en-US"/>
+        </w:rPr>
+        <w:t>https://www.coursera.org</w:t>
+      </w:r>
+      <w:r>
+        <w:rPr>
+          <w:sz w:val="26"/>
+          <w:szCs w:val="26"/>
+          <w:lang w:val="en-US"/>
+        </w:rPr>
+        <w:fldChar w:fldCharType="end"/>
+      </w:r>
       <w:r>
         <w:rPr>
           <w:sz w:val="26"/>
@@ -37898,6 +37931,7 @@
     </w:p>
     <w:p>
       <w:pPr>
+        <w:widowControl w:val="0"/>
         <w:spacing w:after="0"/>
         <w:ind w:firstLine="709"/>
         <w:jc w:val="both"/>
@@ -37915,17 +37949,50 @@
         </w:rPr>
         <w:t xml:space="preserve">4. </w:t>
       </w:r>
-      <w:hyperlink r:id="rId14" w:history="1">
-        <w:r>
-          <w:rPr>
-            <w:rStyle w:val="a8"/>
-            <w:sz w:val="26"/>
-            <w:szCs w:val="26"/>
-            <w:lang w:val="en-US"/>
-          </w:rPr>
-          <w:t>https://ocw.mit.edu</w:t>
-        </w:r>
-      </w:hyperlink>
+      <w:r>
+        <w:rPr>
+          <w:sz w:val="26"/>
+          <w:szCs w:val="26"/>
+        </w:rPr>
+        <w:fldChar w:fldCharType="begin"/>
+      </w:r>
+      <w:r>
+        <w:rPr>
+          <w:sz w:val="26"/>
+          <w:szCs w:val="26"/>
+          <w:lang w:val="en-US"/>
+        </w:rPr>
+        <w:instrText xml:space="preserve"> HYPERLINK "https://ocw.mit.edu" </w:instrText>
+      </w:r>
+      <w:r>
+        <w:rPr>
+          <w:sz w:val="26"/>
+          <w:szCs w:val="26"/>
+        </w:rPr>
+        <w:fldChar w:fldCharType="separate"/>
+      </w:r>
+      <w:r>
+        <w:rPr>
+          <w:rStyle w:val="a8"/>
+          <w:color w:val="auto"/>
+          <w:sz w:val="26"/>
+          <w:szCs w:val="26"/>
+          <w:u w:val="none"/>
+          <w:lang w:val="en-US"/>
+        </w:rPr>
+        <w:t>https://ocw.mit.edu</w:t>
+      </w:r>
+      <w:r>
+        <w:rPr>
+          <w:rStyle w:val="a8"/>
+          <w:color w:val="auto"/>
+          <w:sz w:val="26"/>
+          <w:szCs w:val="26"/>
+          <w:u w:val="none"/>
+          <w:lang w:val="en-US"/>
+        </w:rPr>
+        <w:fldChar w:fldCharType="end"/>
+      </w:r>
       <w:r>
         <w:rPr>
           <w:sz w:val="26"/>
@@ -38199,6 +38266,7 @@
     </w:p>
     <w:p>
       <w:pPr>
+        <w:widowControl w:val="0"/>
         <w:spacing w:after="0"/>
         <w:ind w:firstLine="709"/>
         <w:jc w:val="both"/>
@@ -38217,17 +38285,52 @@
         <w:lastRenderedPageBreak/>
         <w:t>5.</w:t>
       </w:r>
-      <w:hyperlink r:id="rId15" w:history="1">
-        <w:r>
-          <w:rPr>
-            <w:rStyle w:val="a8"/>
-            <w:sz w:val="26"/>
-            <w:szCs w:val="26"/>
-            <w:lang w:val="en-US"/>
-          </w:rPr>
-          <w:t xml:space="preserve"> https://machinelearningmastery.com</w:t>
-        </w:r>
-      </w:hyperlink>
+      <w:r>
+        <w:rPr>
+          <w:sz w:val="26"/>
+          <w:szCs w:val="26"/>
+        </w:rPr>
+        <w:fldChar w:fldCharType="begin"/>
+      </w:r>
+      <w:r>
+        <w:rPr>
+          <w:sz w:val="26"/>
+          <w:szCs w:val="26"/>
+          <w:lang w:val="en-US"/>
+        </w:rPr>
+        <w:instrText xml:space="preserve"> H</w:instrText>
+      </w:r>
+      <w:r>
+        <w:rPr>
+          <w:sz w:val="26"/>
+          <w:szCs w:val="26"/>
+          <w:lang w:val="en-US"/>
+        </w:rPr>
+        <w:instrText xml:space="preserve">YPERLINK "%20https://machinelearningmastery.com" </w:instrText>
+      </w:r>
+      <w:r>
+        <w:rPr>
+          <w:sz w:val="26"/>
+          <w:szCs w:val="26"/>
+        </w:rPr>
+        <w:fldChar w:fldCharType="separate"/>
+      </w:r>
+      <w:r>
+        <w:rPr>
+          <w:sz w:val="26"/>
+          <w:szCs w:val="26"/>
+          <w:lang w:val="en-US"/>
+        </w:rPr>
+        <w:t xml:space="preserve"> https://machinelearningmastery.com</w:t>
+      </w:r>
+      <w:r>
+        <w:rPr>
+          <w:sz w:val="26"/>
+          <w:szCs w:val="26"/>
+          <w:lang w:val="en-US"/>
+        </w:rPr>
+        <w:fldChar w:fldCharType="end"/>
+      </w:r>
       <w:r>
         <w:rPr>
           <w:sz w:val="26"/>
@@ -38375,9 +38478,8 @@
     </w:p>
     <w:p>
       <w:pPr>
-        <w:spacing w:after="0"/>
+        <w:widowControl w:val="0"/>
         <w:ind w:firstLine="709"/>
-        <w:jc w:val="both"/>
         <w:rPr>
           <w:sz w:val="26"/>
           <w:szCs w:val="26"/>
@@ -38392,23 +38494,50 @@
         </w:rPr>
         <w:t xml:space="preserve">6. </w:t>
       </w:r>
-      <w:hyperlink r:id="rId16" w:history="1">
-        <w:r>
-          <w:rPr>
-            <w:rStyle w:val="a8"/>
-            <w:sz w:val="26"/>
-            <w:szCs w:val="26"/>
-            <w:lang w:val="en-US"/>
-          </w:rPr>
-          <w:t>https://www.geeksforgeeks.org</w:t>
-        </w:r>
-      </w:hyperlink>
+      <w:r>
+        <w:rPr>
+          <w:sz w:val="26"/>
+          <w:szCs w:val="26"/>
+        </w:rPr>
+        <w:fldChar w:fldCharType="begin"/>
+      </w:r>
       <w:r>
         <w:rPr>
           <w:sz w:val="26"/>
           <w:szCs w:val="26"/>
           <w:lang w:val="en-US"/>
         </w:rPr>
+        <w:instrText xml:space="preserve"> HYPERLINK "https://www.geeksforgeeks.org" </w:instrText>
+      </w:r>
+      <w:r>
+        <w:rPr>
+          <w:sz w:val="26"/>
+          <w:szCs w:val="26"/>
+        </w:rPr>
+        <w:fldChar w:fldCharType="separate"/>
+      </w:r>
+      <w:r>
+        <w:rPr>
+          <w:sz w:val="26"/>
+          <w:szCs w:val="26"/>
+          <w:lang w:val="en-US"/>
+        </w:rPr>
+        <w:t>https://www.geeksforgeeks.org</w:t>
+      </w:r>
+      <w:r>
+        <w:rPr>
+          <w:sz w:val="26"/>
+          <w:szCs w:val="26"/>
+          <w:lang w:val="en-US"/>
+        </w:rPr>
+        <w:fldChar w:fldCharType="end"/>
+      </w:r>
+      <w:r>
+        <w:rPr>
+          <w:sz w:val="26"/>
+          <w:szCs w:val="26"/>
+          <w:lang w:val="en-US"/>
+        </w:rPr>
         <w:t xml:space="preserve"> – </w:t>
       </w:r>
       <w:proofErr w:type="spellStart"/>
@@ -38635,15 +38764,8 @@
           <w:szCs w:val="26"/>
           <w:lang w:val="en-US"/>
         </w:rPr>
-        <w:t xml:space="preserve">. </w:t>
-      </w:r>
-    </w:p>
-    <w:p>
-      <w:pPr>
-        <w:rPr>
-          <w:lang w:val="en-US"/>
-        </w:rPr>
-      </w:pPr>
+        <w:t>.</w:t>
+      </w:r>
     </w:p>
     <w:sectPr>
       <w:pgSz w:w="11906" w:h="16838"/>

</xml_diff>